<commit_message>
Chỉnh sửa giao diện màn hình trò chơi, bàn cờ và popup kết quả
</commit_message>
<xml_diff>
--- a/docs/New Microsoft Word Document.docx
+++ b/docs/New Microsoft Word Document.docx
@@ -281,12 +281,24 @@
     </w:p>
     <w:p>
       <w:r>
-        <w:t>│   │   ├── app_colors.dart # Khai báo mã màu Monochrome, Neon</w:t>
-      </w:r>
-    </w:p>
-    <w:p>
-      <w:r>
-        <w:t>│   │   └── app_sizes.dart  # Lưu các hằng số như minScale, maxScale cho Zoom chuột</w:t>
+        <w:t xml:space="preserve">│   │   ├── </w:t>
+      </w:r>
+      <w:r>
+        <w:t>mau_sac_app</w:t>
+      </w:r>
+      <w:r>
+        <w:t>.dart # Khai báo mã màu Monochrome, Neon</w:t>
+      </w:r>
+    </w:p>
+    <w:p>
+      <w:r>
+        <w:t xml:space="preserve">│   │   └── </w:t>
+      </w:r>
+      <w:r>
+        <w:t>kich_thuoc_app</w:t>
+      </w:r>
+      <w:r>
+        <w:t>.dart  # Lưu các hằng số như minScale, maxScale cho Zoom chuột</w:t>
       </w:r>
     </w:p>
     <w:p>
@@ -296,12 +308,24 @@
     </w:p>
     <w:p>
       <w:r>
-        <w:t>│   │   ├── cell_state.dart # Enum: Empty, X, O[cite: 2]</w:t>
-      </w:r>
-    </w:p>
-    <w:p>
-      <w:r>
-        <w:t>│   │   └── player_type.dart</w:t>
+        <w:t xml:space="preserve">│   │   ├── </w:t>
+      </w:r>
+      <w:r>
+        <w:t>trang_thai_o</w:t>
+      </w:r>
+      <w:r>
+        <w:t>.dart # Enum: Empty, X, O[cite: 2]</w:t>
+      </w:r>
+    </w:p>
+    <w:p>
+      <w:r>
+        <w:t>│   │   └──</w:t>
+      </w:r>
+      <w:r>
+        <w:t>loai_nguoi_choi</w:t>
+      </w:r>
+      <w:r>
+        <w:t>.dart</w:t>
       </w:r>
     </w:p>
     <w:p>
@@ -311,7 +335,13 @@
     </w:p>
     <w:p>
       <w:r>
-        <w:t>│       └── app_theme.dart  # Config ThemeData chung cho toàn app</w:t>
+        <w:t xml:space="preserve">│       └── </w:t>
+      </w:r>
+      <w:r>
+        <w:t>giao_dien_app</w:t>
+      </w:r>
+      <w:r>
+        <w:t>.dart  # Config ThemeData chung cho toàn app</w:t>
       </w:r>
     </w:p>
     <w:p>
@@ -326,17 +356,35 @@
     </w:p>
     <w:p>
       <w:r>
-        <w:t>│   ├── player_model.dart   # Quản lý định danh, điểm, ký hiệu[cite: 2]</w:t>
-      </w:r>
-    </w:p>
-    <w:p>
-      <w:r>
-        <w:t>│   ├── cell_model.dart     # Quản lý tọa độ (x,y), trạng thái[cite: 2]</w:t>
-      </w:r>
-    </w:p>
-    <w:p>
-      <w:r>
-        <w:t>│   └── board_model.dart    # Xử lý Map&lt;String, Cell&gt; cho bàn vô hạn và List 2D cho bàn thường[cite: 2]</w:t>
+        <w:t xml:space="preserve">│   ├── </w:t>
+      </w:r>
+      <w:r>
+        <w:t>nguoi_choi</w:t>
+      </w:r>
+      <w:r>
+        <w:t>_model.dart   # Quản lý định danh, điểm, ký hiệu[cite: 2]</w:t>
+      </w:r>
+    </w:p>
+    <w:p>
+      <w:r>
+        <w:t xml:space="preserve">│   ├── </w:t>
+      </w:r>
+      <w:r>
+        <w:t>o_co</w:t>
+      </w:r>
+      <w:r>
+        <w:t>_model.dart     # Quản lý tọa độ (x,y), trạng thái[cite: 2]</w:t>
+      </w:r>
+    </w:p>
+    <w:p>
+      <w:r>
+        <w:t xml:space="preserve">│   └── </w:t>
+      </w:r>
+      <w:r>
+        <w:t>ban_co</w:t>
+      </w:r>
+      <w:r>
+        <w:t>_model.dart    # Xử lý Map&lt;String, Cell&gt; cho bàn vô hạn và List 2D cho bàn thường[cite: 2]</w:t>
       </w:r>
     </w:p>
     <w:p>
@@ -351,12 +399,24 @@
     </w:p>
     <w:p>
       <w:r>
-        <w:t>│   ├── game_controller.dart # Điều phối lượt đi, firstMover, timer[cite: 2]</w:t>
-      </w:r>
-    </w:p>
-    <w:p>
-      <w:r>
-        <w:t>│   └── rule_engine.dart    # Chứa thuật toán check Win 4 hướng, đếm blockCount[cite: 2]</w:t>
+        <w:t>│   ├──</w:t>
+      </w:r>
+      <w:r>
+        <w:t>dieu_khien_tro_choi</w:t>
+      </w:r>
+      <w:r>
+        <w:t>.dart # Điều phối lượt đi, firstMover, timer[cite: 2]</w:t>
+      </w:r>
+    </w:p>
+    <w:p>
+      <w:r>
+        <w:t xml:space="preserve">│   └── </w:t>
+      </w:r>
+      <w:r>
+        <w:t>bo_xu_ly_luat</w:t>
+      </w:r>
+      <w:r>
+        <w:t>.dart    # Chứa thuật toán check Win 4 hướng, đếm blockCount[cite: 2]</w:t>
       </w:r>
     </w:p>
     <w:p>
@@ -376,43 +436,88 @@
     </w:p>
     <w:p>
       <w:r>
-        <w:t>│   │   ├── menu_screen.dart # Màn hình chọn chế độ chơi (3x3, 5x5, vô hạn)</w:t>
-      </w:r>
-    </w:p>
-    <w:p>
-      <w:r>
-        <w:t>│   │   └── game_screen.dart # Màn hình chính chứa Header, Body, Footer[cite: 2]</w:t>
+        <w:t>│   │   ├──</w:t>
+      </w:r>
+      <w:r>
+        <w:t>man_hinh_menu</w:t>
+      </w:r>
+      <w:r>
+        <w:t>.dart # Màn hình chọn chế độ chơi (3x3, 5x5, vô hạn)</w:t>
+      </w:r>
+    </w:p>
+    <w:p>
+      <w:r>
+        <w:t xml:space="preserve">│   │   └── </w:t>
+      </w:r>
+      <w:r>
+        <w:t>man_hinh_tro_choi</w:t>
+      </w:r>
+      <w:r>
+        <w:t>.dart # Màn hình chính chứa Header, Body, Footer[cite: 2]</w:t>
       </w:r>
     </w:p>
     <w:p>
       <w:r>
         <w:t>│   │</w:t>
       </w:r>
-    </w:p>
-    <w:p>
-      <w:r>
+      <w:r>
+        <w:t xml:space="preserve">   </w:t>
+      </w:r>
+      <w:r>
+        <w:t>└──</w:t>
+      </w:r>
+      <w:r>
+        <w:t xml:space="preserve"> man_hinh_chon_kich_thuoc.dart </w:t>
+      </w:r>
+    </w:p>
+    <w:p>
+      <w:r>
+        <w:lastRenderedPageBreak/>
         <w:t>│   └── widgets/             # Bóc tách các thành phần UI nhỏ để tái sử dụng</w:t>
       </w:r>
     </w:p>
     <w:p>
       <w:r>
-        <w:lastRenderedPageBreak/>
-        <w:t>│       ├── header_widget.dart  # Avatar 2 người, hiệu ứng Glow[cite: 2]</w:t>
-      </w:r>
-    </w:p>
-    <w:p>
-      <w:r>
-        <w:t>│       ├── board_widget.dart   # Bọc InteractiveViewer và Listener xử lý chuột[cite: 2]</w:t>
-      </w:r>
-    </w:p>
-    <w:p>
-      <w:r>
-        <w:t>│       ├── cell_widget.dart    # UI của từng ô cờ (kẻ viền xám, in chữ X/O)[cite: 2]</w:t>
-      </w:r>
-    </w:p>
-    <w:p>
-      <w:r>
-        <w:t>│       └── footer_widget.dart  # Các nút Undo, Xin hòa, Đầu hàng[cite: 2]</w:t>
+        <w:t>│       ├── widget</w:t>
+      </w:r>
+      <w:r>
+        <w:t>_thanh_dau</w:t>
+      </w:r>
+      <w:r>
+        <w:t>.dart  # Avatar 2 người, hiệu ứng Glow[cite: 2]</w:t>
+      </w:r>
+    </w:p>
+    <w:p>
+      <w:r>
+        <w:t>│       ├── widget</w:t>
+      </w:r>
+      <w:r>
+        <w:t>_ban_co</w:t>
+      </w:r>
+      <w:r>
+        <w:t>.dart   # Bọc InteractiveViewer và Listener xử lý chuột[cite: 2]</w:t>
+      </w:r>
+    </w:p>
+    <w:p>
+      <w:r>
+        <w:t>│       ├── widget</w:t>
+      </w:r>
+      <w:r>
+        <w:t>_o_co</w:t>
+      </w:r>
+      <w:r>
+        <w:t>.dart    # UI của từng ô cờ (kẻ viền xám, in chữ X/O)[cite: 2]</w:t>
+      </w:r>
+    </w:p>
+    <w:p>
+      <w:r>
+        <w:t>│       └── widget</w:t>
+      </w:r>
+      <w:r>
+        <w:t>_thanh_chan</w:t>
+      </w:r>
+      <w:r>
+        <w:t>.dart  # Các nút Undo, Xin hòa, Đầu hàng[cite: 2]</w:t>
       </w:r>
     </w:p>
     <w:p>
@@ -427,7 +532,13 @@
     </w:p>
     <w:p>
       <w:r>
-        <w:t>│   └── coordinate_helper.dart # Hàm chuyển đổi x,y thành String key cho Map và ngược lại</w:t>
+        <w:t>│   └──</w:t>
+      </w:r>
+      <w:r>
+        <w:t>ho_tro_toa_do</w:t>
+      </w:r>
+      <w:r>
+        <w:t>.dart # Hàm chuyển đổi x,y thành String key cho Map và ngược lại</w:t>
       </w:r>
     </w:p>
     <w:p>

</xml_diff>